<commit_message>
Sua grid cha con  va phan trang lai
</commit_message>
<xml_diff>
--- a/modules/work_assignment/views/report/approve/template-word.docx
+++ b/modules/work_assignment/views/report/approve/template-word.docx
@@ -6,19 +6,21 @@
       <w:pPr>
         <w:jc w:val="center"/>
         <w:rPr>
+          <w:rFonts w:ascii="Times New Roman" w:hAnsi="Times New Roman" w:cs="Times New Roman"/>
           <w:b/>
           <w:bCs/>
-          <w:sz w:val="28"/>
-          <w:szCs w:val="28"/>
+          <w:sz w:val="24"/>
+          <w:szCs w:val="24"/>
         </w:rPr>
       </w:pPr>
       <w:r>
         <w:rPr>
+          <w:rFonts w:ascii="Times New Roman" w:hAnsi="Times New Roman" w:cs="Times New Roman"/>
           <w:b/>
           <w:bCs/>
           <w:noProof/>
-          <w:sz w:val="28"/>
-          <w:szCs w:val="28"/>
+          <w:sz w:val="24"/>
+          <w:szCs w:val="24"/>
         </w:rPr>
         <w:drawing>
           <wp:inline distT="0" distB="0" distL="0" distR="0">
@@ -67,10 +69,11 @@
       <w:pPr>
         <w:jc w:val="center"/>
         <w:rPr>
+          <w:rFonts w:ascii="Times New Roman" w:hAnsi="Times New Roman" w:cs="Times New Roman"/>
           <w:b/>
           <w:bCs/>
-          <w:sz w:val="28"/>
-          <w:szCs w:val="28"/>
+          <w:sz w:val="24"/>
+          <w:szCs w:val="24"/>
         </w:rPr>
       </w:pPr>
     </w:p>
@@ -78,9 +81,16 @@
       <w:pPr>
         <w:spacing w:after="0" w:line="312" w:lineRule="auto"/>
         <w:jc w:val="center"/>
+        <w:rPr>
+          <w:rFonts w:ascii="Times New Roman" w:hAnsi="Times New Roman" w:cs="Times New Roman"/>
+          <w:sz w:val="28"/>
+          <w:szCs w:val="28"/>
+        </w:rPr>
       </w:pPr>
+      <w:bookmarkStart w:id="0" w:name="_GoBack"/>
       <w:r>
         <w:rPr>
+          <w:rFonts w:ascii="Times New Roman" w:hAnsi="Times New Roman" w:cs="Times New Roman"/>
           <w:b/>
           <w:bCs/>
           <w:sz w:val="28"/>
@@ -89,19 +99,22 @@
         <w:t>BÁO CÁO LỊCH CÔNG TÁC</w:t>
       </w:r>
     </w:p>
+    <w:bookmarkEnd w:id="0"/>
     <w:p>
       <w:pPr>
         <w:spacing w:after="240"/>
         <w:jc w:val="center"/>
         <w:rPr>
-          <w:sz w:val="22"/>
-          <w:szCs w:val="22"/>
+          <w:rFonts w:ascii="Times New Roman" w:hAnsi="Times New Roman" w:cs="Times New Roman"/>
+          <w:sz w:val="24"/>
+          <w:szCs w:val="24"/>
         </w:rPr>
       </w:pPr>
       <w:r>
         <w:rPr>
-          <w:sz w:val="22"/>
-          <w:szCs w:val="22"/>
+          <w:rFonts w:ascii="Times New Roman" w:hAnsi="Times New Roman" w:cs="Times New Roman"/>
+          <w:sz w:val="24"/>
+          <w:szCs w:val="24"/>
         </w:rPr>
         <w:t>(Từ ngày ${tu_ngay} – đến ngày ${den_ngay})</w:t>
       </w:r>
@@ -113,12 +126,12 @@
         <w:tblLook w:val="04A0" w:firstRow="1" w:lastRow="0" w:firstColumn="1" w:lastColumn="0" w:noHBand="0" w:noVBand="1"/>
       </w:tblPr>
       <w:tblGrid>
-        <w:gridCol w:w="764"/>
-        <w:gridCol w:w="1115"/>
-        <w:gridCol w:w="2464"/>
-        <w:gridCol w:w="1919"/>
-        <w:gridCol w:w="1311"/>
-        <w:gridCol w:w="1487"/>
+        <w:gridCol w:w="794"/>
+        <w:gridCol w:w="1112"/>
+        <w:gridCol w:w="2451"/>
+        <w:gridCol w:w="1907"/>
+        <w:gridCol w:w="1312"/>
+        <w:gridCol w:w="1484"/>
       </w:tblGrid>
       <w:tr>
         <w:tc>
@@ -129,6 +142,7 @@
             <w:pPr>
               <w:jc w:val="center"/>
               <w:rPr>
+                <w:rFonts w:ascii="Times New Roman" w:hAnsi="Times New Roman" w:cs="Times New Roman"/>
                 <w:b/>
                 <w:sz w:val="24"/>
                 <w:szCs w:val="24"/>
@@ -136,6 +150,7 @@
             </w:pPr>
             <w:r>
               <w:rPr>
+                <w:rFonts w:ascii="Times New Roman" w:hAnsi="Times New Roman" w:cs="Times New Roman"/>
                 <w:b/>
                 <w:sz w:val="24"/>
                 <w:szCs w:val="24"/>
@@ -152,6 +167,7 @@
             <w:pPr>
               <w:jc w:val="center"/>
               <w:rPr>
+                <w:rFonts w:ascii="Times New Roman" w:hAnsi="Times New Roman" w:cs="Times New Roman"/>
                 <w:b/>
                 <w:sz w:val="24"/>
                 <w:szCs w:val="24"/>
@@ -159,6 +175,7 @@
             </w:pPr>
             <w:r>
               <w:rPr>
+                <w:rFonts w:ascii="Times New Roman" w:hAnsi="Times New Roman" w:cs="Times New Roman"/>
                 <w:b/>
                 <w:sz w:val="24"/>
                 <w:szCs w:val="24"/>
@@ -175,6 +192,7 @@
             <w:pPr>
               <w:jc w:val="center"/>
               <w:rPr>
+                <w:rFonts w:ascii="Times New Roman" w:hAnsi="Times New Roman" w:cs="Times New Roman"/>
                 <w:b/>
                 <w:sz w:val="24"/>
                 <w:szCs w:val="24"/>
@@ -182,6 +200,7 @@
             </w:pPr>
             <w:r>
               <w:rPr>
+                <w:rFonts w:ascii="Times New Roman" w:hAnsi="Times New Roman" w:cs="Times New Roman"/>
                 <w:b/>
                 <w:sz w:val="24"/>
                 <w:szCs w:val="24"/>
@@ -197,6 +216,7 @@
           <w:p>
             <w:pPr>
               <w:rPr>
+                <w:rFonts w:ascii="Times New Roman" w:hAnsi="Times New Roman" w:cs="Times New Roman"/>
                 <w:b/>
                 <w:sz w:val="24"/>
                 <w:szCs w:val="24"/>
@@ -204,6 +224,7 @@
             </w:pPr>
             <w:r>
               <w:rPr>
+                <w:rFonts w:ascii="Times New Roman" w:hAnsi="Times New Roman" w:cs="Times New Roman"/>
                 <w:b/>
                 <w:sz w:val="24"/>
                 <w:szCs w:val="24"/>
@@ -220,6 +241,7 @@
             <w:pPr>
               <w:jc w:val="center"/>
               <w:rPr>
+                <w:rFonts w:ascii="Times New Roman" w:hAnsi="Times New Roman" w:cs="Times New Roman"/>
                 <w:b/>
                 <w:sz w:val="24"/>
                 <w:szCs w:val="24"/>
@@ -227,21 +249,12 @@
             </w:pPr>
             <w:r>
               <w:rPr>
+                <w:rFonts w:ascii="Times New Roman" w:hAnsi="Times New Roman" w:cs="Times New Roman"/>
                 <w:b/>
                 <w:sz w:val="24"/>
                 <w:szCs w:val="24"/>
               </w:rPr>
-              <w:t>Tr</w:t>
-            </w:r>
-            <w:bookmarkStart w:id="0" w:name="_GoBack"/>
-            <w:bookmarkEnd w:id="0"/>
-            <w:r>
-              <w:rPr>
-                <w:b/>
-                <w:sz w:val="24"/>
-                <w:szCs w:val="24"/>
-              </w:rPr>
-              <w:t>ạng thái</w:t>
+              <w:t>Trạng thái</w:t>
             </w:r>
           </w:p>
         </w:tc>
@@ -252,6 +265,7 @@
           <w:p>
             <w:pPr>
               <w:rPr>
+                <w:rFonts w:ascii="Times New Roman" w:hAnsi="Times New Roman" w:cs="Times New Roman"/>
                 <w:b/>
                 <w:sz w:val="24"/>
                 <w:szCs w:val="24"/>
@@ -259,6 +273,7 @@
             </w:pPr>
             <w:r>
               <w:rPr>
+                <w:rFonts w:ascii="Times New Roman" w:hAnsi="Times New Roman" w:cs="Times New Roman"/>
                 <w:b/>
                 <w:sz w:val="24"/>
                 <w:szCs w:val="24"/>
@@ -277,12 +292,14 @@
             <w:pPr>
               <w:jc w:val="center"/>
               <w:rPr>
+                <w:rFonts w:ascii="Times New Roman" w:hAnsi="Times New Roman" w:cs="Times New Roman"/>
                 <w:sz w:val="24"/>
                 <w:szCs w:val="24"/>
               </w:rPr>
             </w:pPr>
             <w:r>
               <w:rPr>
+                <w:rFonts w:ascii="Times New Roman" w:hAnsi="Times New Roman" w:cs="Times New Roman"/>
                 <w:sz w:val="24"/>
                 <w:szCs w:val="24"/>
               </w:rPr>
@@ -297,27 +314,19 @@
           <w:p>
             <w:pPr>
               <w:jc w:val="center"/>
+              <w:rPr>
+                <w:rFonts w:ascii="Times New Roman" w:hAnsi="Times New Roman" w:cs="Times New Roman"/>
+                <w:sz w:val="24"/>
+                <w:szCs w:val="24"/>
+              </w:rPr>
             </w:pPr>
             <w:r>
               <w:rPr>
-                <w:sz w:val="24"/>
-                <w:szCs w:val="24"/>
-              </w:rPr>
-              <w:t>${</w:t>
-            </w:r>
-            <w:r>
-              <w:rPr>
-                <w:sz w:val="24"/>
-                <w:szCs w:val="24"/>
-              </w:rPr>
-              <w:t>date</w:t>
-            </w:r>
-            <w:r>
-              <w:rPr>
-                <w:sz w:val="24"/>
-                <w:szCs w:val="24"/>
-              </w:rPr>
-              <w:t>}</w:t>
+                <w:rFonts w:ascii="Times New Roman" w:hAnsi="Times New Roman" w:cs="Times New Roman"/>
+                <w:sz w:val="24"/>
+                <w:szCs w:val="24"/>
+              </w:rPr>
+              <w:t>${date}</w:t>
             </w:r>
           </w:p>
         </w:tc>
@@ -326,26 +335,20 @@
             <w:tcW w:w="2489" w:type="dxa"/>
           </w:tcPr>
           <w:p>
-            <w:r>
-              <w:rPr>
-                <w:sz w:val="24"/>
-                <w:szCs w:val="24"/>
-              </w:rPr>
-              <w:t>${</w:t>
-            </w:r>
-            <w:r>
-              <w:rPr>
-                <w:sz w:val="24"/>
-                <w:szCs w:val="24"/>
-              </w:rPr>
-              <w:t>description</w:t>
-            </w:r>
-            <w:r>
-              <w:rPr>
-                <w:sz w:val="24"/>
-                <w:szCs w:val="24"/>
-              </w:rPr>
-              <w:t>}</w:t>
+            <w:pPr>
+              <w:rPr>
+                <w:rFonts w:ascii="Times New Roman" w:hAnsi="Times New Roman" w:cs="Times New Roman"/>
+                <w:sz w:val="24"/>
+                <w:szCs w:val="24"/>
+              </w:rPr>
+            </w:pPr>
+            <w:r>
+              <w:rPr>
+                <w:rFonts w:ascii="Times New Roman" w:hAnsi="Times New Roman" w:cs="Times New Roman"/>
+                <w:sz w:val="24"/>
+                <w:szCs w:val="24"/>
+              </w:rPr>
+              <w:t>${description}</w:t>
             </w:r>
           </w:p>
         </w:tc>
@@ -354,14 +357,20 @@
             <w:tcW w:w="1949" w:type="dxa"/>
           </w:tcPr>
           <w:p>
-            <w:r>
-              <w:t>${</w:t>
-            </w:r>
-            <w:r>
-              <w:t>staff</w:t>
-            </w:r>
-            <w:r>
-              <w:t>}</w:t>
+            <w:pPr>
+              <w:rPr>
+                <w:rFonts w:ascii="Times New Roman" w:hAnsi="Times New Roman" w:cs="Times New Roman"/>
+                <w:sz w:val="24"/>
+                <w:szCs w:val="24"/>
+              </w:rPr>
+            </w:pPr>
+            <w:r>
+              <w:rPr>
+                <w:rFonts w:ascii="Times New Roman" w:hAnsi="Times New Roman" w:cs="Times New Roman"/>
+                <w:sz w:val="24"/>
+                <w:szCs w:val="24"/>
+              </w:rPr>
+              <w:t>${staff}</w:t>
             </w:r>
           </w:p>
         </w:tc>
@@ -372,14 +381,34 @@
           <w:p>
             <w:pPr>
               <w:jc w:val="center"/>
+              <w:rPr>
+                <w:rFonts w:ascii="Times New Roman" w:hAnsi="Times New Roman" w:cs="Times New Roman"/>
+                <w:sz w:val="24"/>
+                <w:szCs w:val="24"/>
+              </w:rPr>
             </w:pPr>
             <w:r>
+              <w:rPr>
+                <w:rFonts w:ascii="Times New Roman" w:hAnsi="Times New Roman" w:cs="Times New Roman"/>
+                <w:sz w:val="24"/>
+                <w:szCs w:val="24"/>
+              </w:rPr>
               <w:t>${</w:t>
             </w:r>
             <w:r>
+              <w:rPr>
+                <w:rFonts w:ascii="Times New Roman" w:hAnsi="Times New Roman" w:cs="Times New Roman"/>
+                <w:sz w:val="24"/>
+                <w:szCs w:val="24"/>
+              </w:rPr>
               <w:t>status</w:t>
             </w:r>
             <w:r>
+              <w:rPr>
+                <w:rFonts w:ascii="Times New Roman" w:hAnsi="Times New Roman" w:cs="Times New Roman"/>
+                <w:sz w:val="24"/>
+                <w:szCs w:val="24"/>
+              </w:rPr>
               <w:t>}</w:t>
             </w:r>
           </w:p>
@@ -389,7 +418,19 @@
             <w:tcW w:w="1507" w:type="dxa"/>
           </w:tcPr>
           <w:p>
-            <w:r>
+            <w:pPr>
+              <w:rPr>
+                <w:rFonts w:ascii="Times New Roman" w:hAnsi="Times New Roman" w:cs="Times New Roman"/>
+                <w:sz w:val="24"/>
+                <w:szCs w:val="24"/>
+              </w:rPr>
+            </w:pPr>
+            <w:r>
+              <w:rPr>
+                <w:rFonts w:ascii="Times New Roman" w:hAnsi="Times New Roman" w:cs="Times New Roman"/>
+                <w:sz w:val="24"/>
+                <w:szCs w:val="24"/>
+              </w:rPr>
               <w:t>${note}</w:t>
             </w:r>
           </w:p>
@@ -399,6 +440,11 @@
     <w:p>
       <w:pPr>
         <w:jc w:val="center"/>
+        <w:rPr>
+          <w:rFonts w:ascii="Times New Roman" w:hAnsi="Times New Roman" w:cs="Times New Roman"/>
+          <w:sz w:val="24"/>
+          <w:szCs w:val="24"/>
+        </w:rPr>
       </w:pPr>
     </w:p>
     <w:sectPr>

</xml_diff>